<commit_message>
fix(defense-ai-idea-contest): 공식 HWP 양식 구조 반영 및 사실관계 오류 수정
양식 일치
- 공식 HWP(38행 6열 단일 표) 구조 그대로 재현, 제목을 표 내부 행으로 이동
- 편집용지 A4 좌우 20mm / 위·아래 15mm + 머리말·꼬리말 10mm 반영
- 1)~6) 항목 라벨을 별도 음영 행으로 분리, '6) 기타(자유 작성)' 라벨 정정
- 열 너비를 원본 HWPUNIT 값 그대로 환산 적용

사실관계 수정
- 1인당 배출량 비교의 연도 혼동 정정(2020년 장병 182kg 대 국민 100kg)
- 처리비 자료 귀속 정정(국정감사 제출자료 -> 기획재정부 제시자료)
- 미검증 급식·피복 예산 수치 삭제, 확정예산 기준 기본급식비만 유지
- 기존 자동 청구 체계가 예측을 수행한다는 사실 반영해 차별성 논지 재구성
- 선행연구 2 서지 정정 및 미검증 링크 제거
- 발표 대비자료의 동일 오류 동반 수정
</commit_message>
<xml_diff>
--- a/defense-ai-idea-contest/발표심사 대비자료_스크립트 및 예상질의응답.docx
+++ b/defense-ai-idea-contest/발표심사 대비자료_스크립트 및 예상질의응답.docx
@@ -144,7 +144,7 @@
           <w:sz w:val="22"/>
           <w:szCs w:val="22"/>
         </w:rPr>
-        <w:t xml:space="preserve">군의 음식물류폐기물 처리비용은 2018년 약 103억 원에서 2023년 약 195억 원으로 늘었습니다. 같은 기간 병력은 줄었는데 처리비는 두 배 가까이 늘었습니다. 장병 한 사람이 버리는 양은 연간 195킬로그램으로, 국민 1인당 배출량의 약 1.8배 수준으로 보고됩니다. 국정감사에 제출된 국방부 자료를 인용한 보도 기준입니다.</w:t>
+        <w:t xml:space="preserve">군의 음식물 쓰레기 처리비용은 2018년 약 103억 원에서 2023년 약 195억 원으로 늘었습니다. 같은 기간 병력은 줄었는데 처리비는 두 배 가까이 늘었습니다. 2020년을 기준으로 보면 장병 한 사람이 버린 양은 182킬로그램으로, 같은 해 국민 1인당 100킬로그램의 약 1.8배였습니다. 국방부가 기획재정부에 제시한 자료, 그리고 국정감사 제출자료를 인용한 보도 기준입니다.</w:t>
       </w:r>
     </w:p>
     <w:p>
@@ -418,7 +418,7 @@
           <w:sz w:val="22"/>
           <w:szCs w:val="22"/>
         </w:rPr>
-        <w:t xml:space="preserve">비슷한 제안이 있을 겁니다. 그래서 분명히 말씀드립니다. 저희는 식수 인원을 예측하지 않습니다.</w:t>
+        <w:t xml:space="preserve">비슷한 제안이 있을 겁니다. 그래서 분명히 말씀드립니다. 저희는 식수 인원을 예측하지 않습니다. 신고값이 얼마나 빗나가는지, 그 빗나감의 분포를 예측합니다.</w:t>
       </w:r>
     </w:p>
     <w:p>
@@ -436,7 +436,7 @@
           <w:sz w:val="22"/>
           <w:szCs w:val="22"/>
         </w:rPr>
-        <w:t xml:space="preserve">식수를 예측해서 알려주면 담당자는 결국 그 위에 감으로 여유분을 얹습니다. 문제가 그대로 남습니다. 저희가 내놓는 것은 예측값이 아니라, 지휘관이 정한 위험 수준이 반영된 결정값입니다.</w:t>
+        <w:t xml:space="preserve">식수를 하나의 숫자로 예측해서 알려주면 담당자는 결국 그 위에 감으로 여유분을 얹습니다. 문제가 그대로 남습니다. 저희가 내놓는 것은 점추정이 아니라, 확률분포에 지휘관이 정한 위험 수준을 적용해 나온 결정값입니다.</w:t>
       </w:r>
     </w:p>
     <w:p>
@@ -454,7 +454,7 @@
           <w:sz w:val="22"/>
           <w:szCs w:val="22"/>
         </w:rPr>
-        <w:t xml:space="preserve">군 일부 제대에는 이미 급식 인원 집계와 청구를 자동화한 체계가 도입되어 있습니다. 저는 그 체계와 경쟁하지 않습니다. 그 체계는 신고된 값을 빠르고 정확하게 집계합니다. 저는 신고와 실제가 얼마나 벌어질지를 다룹니다. 오히려 그 체계가 표준화해 놓은 데이터는 제 모델의 가장 좋은 입력입니다. 두 체계는 층위가 다르고 함께 쓸 때 더 좋습니다.</w:t>
+        <w:t xml:space="preserve">군 일부 제대에는 이미 급식 자동 청구 체계가 도입되어 있습니다. 그 체계도 식수 인원을 파악하고 적정 식재료량을 예측합니다. 저는 그 체계가 예측을 안 한다고 말씀드리는 것이 아닙니다. 차이는 예측의 유무가 아니라 불확실성을 다루는 방식입니다. 점추정은 얼마일 것 같다까지만 말하고, 어느 범위로 어느 쪽으로 빗나가는지는 말하지 않습니다. 그 판단이 남는 한 여유분은 여전히 개인의 감각이고 기록되지 않습니다. 오히려 그 체계가 표준화해 놓은 집계 데이터는 제 모델의 가장 정제된 입력입니다. 그 체계가 도입된 부대일수록 제 제안의 효과가 커집니다.</w:t>
       </w:r>
     </w:p>
     <w:p>
@@ -618,7 +618,7 @@
           <w:sz w:val="22"/>
           <w:szCs w:val="22"/>
         </w:rPr>
-        <w:t xml:space="preserve">처리비 195억 원을 모수로, 배출량을 5퍼센트 줄이면 약 9.8억 원, 10퍼센트면 약 19.5억 원, 15퍼센트면 약 29.3억 원입니다. 감축률은 검증된 값이 아니라 가정치이며 시범운용에서 실측할 항목입니다. 버려지는 식자재비 절감은 이보다 클 것으로 보지만, 근거가 될 공식 통계를 찾지 못해 금액으로 계상하지 않았습니다.</w:t>
+        <w:t xml:space="preserve">군 음식물 쓰레기 처리비 195억 원을 모수로, 배출량을 5퍼센트 줄이면 약 9.8억 원, 10퍼센트면 약 19.5억 원, 15퍼센트면 약 29.3억 원입니다. 감축률은 검증된 값이 아니라 가정치이며 시범운용에서 실측할 항목입니다. 버려지는 식자재비 절감은 이보다 클 것으로 보지만, 근거가 될 공식 통계를 찾지 못해 금액으로 계상하지 않았습니다.</w:t>
       </w:r>
     </w:p>
     <w:p>
@@ -999,7 +999,7 @@
                 <w:sz w:val="22"/>
                 <w:szCs w:val="22"/>
               </w:rPr>
-              <w:t xml:space="preserve">Q2. 기존 국방 체계와 무엇이 다른가? 이미 급식 자동화가 도입되고 있지 않은가?</w:t>
+              <w:t xml:space="preserve">Q2. 기존 국방 체계와 무엇이 다른가? 이미 급식 자동 청구 체계가 도입되어 식재료량을 예측하고 있지 않은가?</w:t>
             </w:r>
             <w:r>
               <w:rPr>
@@ -1056,61 +1056,79 @@
                 <w:sz w:val="22"/>
                 <w:szCs w:val="22"/>
               </w:rPr>
-              <w:t xml:space="preserve">맞습니다. 군 일부 제대에 급식 인원 집계와 식자재 청구를 자동화한 체계가 도입되었고 성과도 보도되었습니다. 저는 그 체계를 대체하려는 것이 아닙니다.</w:t>
-            </w:r>
-          </w:p>
-          <w:p>
-            <w:pPr>
-              <w:spacing w:after="40" w:before="0" w:line="276"/>
-              <w:jc w:val="both"/>
-            </w:pPr>
-            <w:r>
-              <w:rPr>
-                <w:rFonts w:ascii="맑은 고딕" w:cs="맑은 고딕" w:eastAsia="맑은 고딕" w:hAnsi="맑은 고딕"/>
-                <w:b w:val="false"/>
-                <w:bCs w:val="false"/>
-                <w:i w:val="false"/>
-                <w:iCs w:val="false"/>
-                <w:sz w:val="22"/>
-                <w:szCs w:val="22"/>
-              </w:rPr>
-              <w:t xml:space="preserve">경계를 분명히 하겠습니다. 그 체계가 다루는 질문은 “신고된 값을 얼마나 정확하고 빠르게 집계하고 청구할 것인가”입니다. 제가 다루는 질문은 “신고값과 실제가 얼마나 벌어질 것이며, 그 불확실성 아래에서 결식위험을 얼마나 감수하며 얼마를 만들 것인가”입니다.</w:t>
-            </w:r>
-          </w:p>
-          <w:p>
-            <w:pPr>
-              <w:spacing w:after="40" w:before="0" w:line="276"/>
-              <w:jc w:val="both"/>
-            </w:pPr>
-            <w:r>
-              <w:rPr>
-                <w:rFonts w:ascii="맑은 고딕" w:cs="맑은 고딕" w:eastAsia="맑은 고딕" w:hAnsi="맑은 고딕"/>
-                <w:b w:val="false"/>
-                <w:bCs w:val="false"/>
-                <w:i w:val="false"/>
-                <w:iCs w:val="false"/>
-                <w:sz w:val="22"/>
-                <w:szCs w:val="22"/>
-              </w:rPr>
-              <w:t xml:space="preserve">예를 들어 신고가 800명이라면, 기존 체계는 800명분 식자재를 정확하게 청구합니다. 제 체계는 “이 부대는 목요일 저녁 이 메뉴에서 신고보다 평균 40명 적게 먹고, 편차의 99퍼센트 구간은 여기까지”라고 알려주고, 지휘관이 정한 위험 수준에 맞는 취사량을 권고합니다.</w:t>
-            </w:r>
-          </w:p>
-          <w:p>
-            <w:pPr>
-              <w:spacing w:after="40" w:before="0" w:line="276"/>
-              <w:jc w:val="both"/>
-            </w:pPr>
-            <w:r>
-              <w:rPr>
-                <w:rFonts w:ascii="맑은 고딕" w:cs="맑은 고딕" w:eastAsia="맑은 고딕" w:hAnsi="맑은 고딕"/>
-                <w:b w:val="false"/>
-                <w:bCs w:val="false"/>
-                <w:i w:val="false"/>
-                <w:iCs w:val="false"/>
-                <w:sz w:val="22"/>
-                <w:szCs w:val="22"/>
-              </w:rPr>
-              <w:t xml:space="preserve">그리고 두 체계는 함께 쓸 때 더 좋습니다. 자동화 체계가 표준화해 놓은 집계 데이터는 제 모델의 가장 깨끗한 입력입니다. 그 체계가 도입된 부대일수록 제 모델이 더 잘 작동합니다.</w:t>
+              <w:t xml:space="preserve">맞습니다. 군 일부 제대에 급식 자동 청구 체계가 도입되었고, 보도에 따르면 식수 인원을 파악해 적정 식재료량을 예측하는 것이 그 체계의 임무입니다. 그 체계가 예측을 하지 않는다고 말씀드리지 않겠습니다. 그건 사실이 아닙니다.</w:t>
+            </w:r>
+          </w:p>
+          <w:p>
+            <w:pPr>
+              <w:spacing w:after="40" w:before="0" w:line="276"/>
+              <w:jc w:val="both"/>
+            </w:pPr>
+            <w:r>
+              <w:rPr>
+                <w:rFonts w:ascii="맑은 고딕" w:cs="맑은 고딕" w:eastAsia="맑은 고딕" w:hAnsi="맑은 고딕"/>
+                <w:b w:val="false"/>
+                <w:bCs w:val="false"/>
+                <w:i w:val="false"/>
+                <w:iCs w:val="false"/>
+                <w:sz w:val="22"/>
+                <w:szCs w:val="22"/>
+              </w:rPr>
+              <w:t xml:space="preserve">차이는 예측의 유무가 아니라 불확실성을 다루는 방식에 있습니다. 기존 체계의 산출물은 점추정입니다. 점추정은 “얼마일 것 같다”까지만 말합니다. 그 추정이 어느 범위로 빗나가는지, 어느 쪽으로 빗나가는 것이 더 위험한지는 말하지 않습니다.</w:t>
+            </w:r>
+          </w:p>
+          <w:p>
+            <w:pPr>
+              <w:spacing w:after="40" w:before="0" w:line="276"/>
+              <w:jc w:val="both"/>
+            </w:pPr>
+            <w:r>
+              <w:rPr>
+                <w:rFonts w:ascii="맑은 고딕" w:cs="맑은 고딕" w:eastAsia="맑은 고딕" w:hAnsi="맑은 고딕"/>
+                <w:b w:val="false"/>
+                <w:bCs w:val="false"/>
+                <w:i w:val="false"/>
+                <w:iCs w:val="false"/>
+                <w:sz w:val="22"/>
+                <w:szCs w:val="22"/>
+              </w:rPr>
+              <w:t xml:space="preserve">예를 들어 기존 체계가 “내일 저녁 780명분”이라고 알려줬다고 하겠습니다. 담당자는 그대로 만들지 않습니다. 결식이 무섭기 때문에 감으로 여유를 얹습니다. 그 여유분이 얼마인지, 왜 그만큼인지는 어디에도 기록되지 않습니다. 문제는 여기서 발생합니다.</w:t>
+            </w:r>
+          </w:p>
+          <w:p>
+            <w:pPr>
+              <w:spacing w:after="40" w:before="0" w:line="276"/>
+              <w:jc w:val="both"/>
+            </w:pPr>
+            <w:r>
+              <w:rPr>
+                <w:rFonts w:ascii="맑은 고딕" w:cs="맑은 고딕" w:eastAsia="맑은 고딕" w:hAnsi="맑은 고딕"/>
+                <w:b w:val="false"/>
+                <w:bCs w:val="false"/>
+                <w:i w:val="false"/>
+                <w:iCs w:val="false"/>
+                <w:sz w:val="22"/>
+                <w:szCs w:val="22"/>
+              </w:rPr>
+              <w:t xml:space="preserve">제 체계의 산출물은 편차의 확률분포와, 지휘관이 선언한 위험 허용 수준을 적용해 나온 결정값입니다. “결식 확률 1퍼센트를 감수하겠다”고 정하면 그에 해당하는 분위값이 권고 취사량이 됩니다. 여유분이 감각이 아니라 정책 수치에서 계산되고, 목표 위험과 실제 달성률이 매일 기록되고 검증됩니다.</w:t>
+            </w:r>
+          </w:p>
+          <w:p>
+            <w:pPr>
+              <w:spacing w:after="40" w:before="0" w:line="276"/>
+              <w:jc w:val="both"/>
+            </w:pPr>
+            <w:r>
+              <w:rPr>
+                <w:rFonts w:ascii="맑은 고딕" w:cs="맑은 고딕" w:eastAsia="맑은 고딕" w:hAnsi="맑은 고딕"/>
+                <w:b w:val="false"/>
+                <w:bCs w:val="false"/>
+                <w:i w:val="false"/>
+                <w:iCs w:val="false"/>
+                <w:sz w:val="22"/>
+                <w:szCs w:val="22"/>
+              </w:rPr>
+              <w:t xml:space="preserve">두 체계는 경쟁 관계가 아닙니다. 자동 청구 체계가 표준화해 놓은 집계 데이터는 제 모델의 가장 정제된 입력입니다. 그 체계가 도입된 부대일수록 제 제안이 더 잘 작동합니다.</w:t>
             </w:r>
           </w:p>
           <w:p>
@@ -1141,7 +1159,7 @@
                 <w:sz w:val="22"/>
                 <w:szCs w:val="22"/>
               </w:rPr>
-              <w:t xml:space="preserve">집계와 청구는 그 체계가, 예측과 결정은 제 체계가 맡습니다. 겹치는 것이 아니라 위아래로 얹히는 관계입니다.</w:t>
+              <w:t xml:space="preserve">그 체계는 추정을 정확하게 만듭니다. 제 체계는 추정에 남는 불확실성을 누가 어떻게 감당할지 정하게 만듭니다.</w:t>
             </w:r>
           </w:p>
         </w:tc>
@@ -1823,25 +1841,25 @@
                 <w:sz w:val="22"/>
                 <w:szCs w:val="22"/>
               </w:rPr>
-              <w:t xml:space="preserve">다만 근거 없이 정하지는 않았습니다. 상한을 잡는 논리가 있습니다. 장병 1인당 배출량은 195킬로그램으로 국민 1인당의 약 1.8배 수준으로 보고됩니다. 격차가 약 95킬로그램입니다.</w:t>
-            </w:r>
-          </w:p>
-          <w:p>
-            <w:pPr>
-              <w:spacing w:after="40" w:before="0" w:line="276"/>
-              <w:jc w:val="both"/>
-            </w:pPr>
-            <w:r>
-              <w:rPr>
-                <w:rFonts w:ascii="맑은 고딕" w:cs="맑은 고딕" w:eastAsia="맑은 고딕" w:hAnsi="맑은 고딕"/>
-                <w:b w:val="false"/>
-                <w:bCs w:val="false"/>
-                <w:i w:val="false"/>
-                <w:iCs w:val="false"/>
-                <w:sz w:val="22"/>
-                <w:szCs w:val="22"/>
-              </w:rPr>
-              <w:t xml:space="preserve">그런데 이 격차 전부를 감축 목표로 잡으면 안 됩니다. 군은 하루 세 끼를 전량 단체급식으로 제공하고 민간은 그렇지 않기 때문에, 격차의 상당 부분은 구조적인 것입니다. 그래서 격차의 일부만 회수 대상으로 보고, 전체 배출량 대비 5에서 15퍼센트 범위로 잡았습니다.</w:t>
+              <w:t xml:space="preserve">다만 근거 없이 정하지는 않았습니다. 상한을 잡는 논리가 있습니다. 2020년을 기준으로 장병 1인당 배출량은 182킬로그램, 같은 해 국민 1인당은 100킬로그램으로 약 1.8배입니다. 격차가 약 82킬로그램입니다. 연도를 섞으면 안 되기 때문에 같은 해 기준으로만 비교했습니다.</w:t>
+            </w:r>
+          </w:p>
+          <w:p>
+            <w:pPr>
+              <w:spacing w:after="40" w:before="0" w:line="276"/>
+              <w:jc w:val="both"/>
+            </w:pPr>
+            <w:r>
+              <w:rPr>
+                <w:rFonts w:ascii="맑은 고딕" w:cs="맑은 고딕" w:eastAsia="맑은 고딕" w:hAnsi="맑은 고딕"/>
+                <w:b w:val="false"/>
+                <w:bCs w:val="false"/>
+                <w:i w:val="false"/>
+                <w:iCs w:val="false"/>
+                <w:sz w:val="22"/>
+                <w:szCs w:val="22"/>
+              </w:rPr>
+              <w:t xml:space="preserve">그런데 이 격차 전부를 감축 목표로 잡으면 안 됩니다. 군은 하루 세 끼를 전량 단체급식으로 제공하는 반면 민간 통계의 산정 범위는 이와 다르기 때문에, 격차의 상당 부분은 구조적인 것입니다. 그래서 격차의 일부만 회수 대상으로 보고, 전체 배출량 대비 5에서 15퍼센트 범위로 잡았습니다.</w:t>
             </w:r>
           </w:p>
           <w:p>
@@ -2054,7 +2072,7 @@
                 <w:sz w:val="22"/>
                 <w:szCs w:val="22"/>
               </w:rPr>
-              <w:t xml:space="preserve">또한 제 제안은 예측 대상 자체가 다릅니다. 민간은 절대 인원을 예측하지만 저는 기존 신고값 대비 편차를 학습합니다. 군에는 식수인원 신고라는 절차가 이미 있기 때문에 가능한 방식이며, 이 절차가 없는 민간에서는 성립하지 않습니다.</w:t>
+              <w:t xml:space="preserve">또한 예측 대상 자체가 다릅니다. 민간은 절대 인원을 예측하지만 저는 기존 신고값 대비 편차를 학습합니다. 군에는 식수인원 신고라는 절차가 제도로 존재하기 때문에 가능한 방식이며, 이 절차가 없는 민간에서는 성립하지 않습니다.</w:t>
             </w:r>
           </w:p>
           <w:p>

</xml_diff>